<commit_message>
Refresh RFQ timeline: issue 2026-09-24, quotations due 2026-10-22
Dates-only update to the procurement package (no scope or technical
changes): the original 28 Aug issue timeline had lapsed before the RFQ
went out. New programme — questions close 8 Oct, addendum 13 Oct,
quotations due 22 Oct 17:00 AEST, target order early Dec 2026, CIF
Brisbane arrival Q2 2027. BMSB clause made conditional on sailing date
(departures on or before 30 April need offshore treatment). Both
documents regenerated; BOM recalculated clean (381 formulas, 0 errors;
totals unchanged at 244 items / 20.7 t groups C-F).

Co-Authored-By: Claude Fable 5 <noreply@anthropic.com>
Claude-Session: https://claude.ai/code/session_01PADNFrCidghnumqxYcBMLf
</commit_message>
<xml_diff>
--- a/container-workshop/procurement/Container-Workshop_RFQ-Brief_RevC.docx
+++ b/container-workshop/procurement/Container-Workshop_RFQ-Brief_RevC.docx
@@ -315,7 +315,7 @@
                 <w:sz w:val="18"/>
                 <w:szCs w:val="18"/>
               </w:rPr>
-              <w:t xml:space="preserve">28 August 2026</w:t>
+              <w:t xml:space="preserve">24 September 2026</w:t>
             </w:r>
           </w:p>
         </w:tc>
@@ -372,7 +372,7 @@
                 <w:sz w:val="18"/>
                 <w:szCs w:val="18"/>
               </w:rPr>
-              <w:t xml:space="preserve">11 September 2026</w:t>
+              <w:t xml:space="preserve">8 October 2026</w:t>
             </w:r>
           </w:p>
         </w:tc>
@@ -429,7 +429,7 @@
                 <w:sz w:val="18"/>
                 <w:szCs w:val="18"/>
               </w:rPr>
-              <w:t xml:space="preserve">25 September 2026, 17:00 AEST</w:t>
+              <w:t xml:space="preserve">22 October 2026, 17:00 AEST</w:t>
             </w:r>
           </w:p>
         </w:tc>
@@ -1079,7 +1079,7 @@
           <w:sz w:val="19"/>
           <w:szCs w:val="19"/>
         </w:rPr>
-        <w:t xml:space="preserve">致：预制建筑制造商及设备供应商 — 澳大利亚 The Carbon Project 现就“集装箱车间”项目进行国际询价。项目由三个 40 英尺高柜集装箱与门式钢架保温围护结构组成，含 2 吨桥式起重机、四台 6 吨地埋式举升机、52.08 kW 屋顶光伏及储能与充电系统、以及全传感器化楼宇控制系统。请按随附 BOM 工作簿（Excel，共 244 项、25 组）逐项报价；可整套报价（优先）或按第 3 节的分包范围报价。报价截止：2026 年 9 月 25 日。所有技术要求以英文版本为准。联系邮箱：aaron@carbonproject.com.au。</w:t>
+        <w:t xml:space="preserve">致：预制建筑制造商及设备供应商 — 澳大利亚 The Carbon Project 现就“集装箱车间”项目进行国际询价。项目由三个 40 英尺高柜集装箱与门式钢架保温围护结构组成，含 2 吨桥式起重机、四台 6 吨地埋式举升机、52.08 kW 屋顶光伏及储能与充电系统、以及全传感器化楼宇控制系统。请按随附 BOM 工作簿（Excel，共 244 项、25 组）逐项报价；可整套报价（优先）或按第 3 节的分包范围报价。报价截止：2026 年 10 月 22 日。所有技术要求以英文版本为准。联系邮箱：aaron@carbonproject.com.au。</w:t>
       </w:r>
     </w:p>
     <w:p>
@@ -7153,7 +7153,7 @@
           <w:sz w:val="20"/>
           <w:szCs w:val="20"/>
         </w:rPr>
-        <w:t xml:space="preserve">Biosecurity: all timber ISPM 15; cargo free of soil, seeds and insect contamination (Australian DAFF inspection standard). Shipments departing 1 September – 30 April fall inside the BMSB (brown marmorated stink bug) season and require offshore treatment by an approved provider with certificates — the target Q1 2027 arrival is inside this window, so include BMSB treatment in your freight line.</w:t>
+        <w:t xml:space="preserve">Biosecurity: all timber ISPM 15; cargo free of soil, seeds and insect contamination (Australian DAFF inspection standard). Shipments departing 1 September – 30 April fall inside the BMSB (brown marmorated stink bug) season and require offshore treatment by an approved provider with certificates — the target Q2 2027 arrival puts the sailing near the season boundary, so confirm your sailing date at booking and include BMSB treatment in your freight line for any departure on or before 30 April.</w:t>
       </w:r>
     </w:p>
     <w:p>
@@ -7418,7 +7418,7 @@
                 <w:sz w:val="18"/>
                 <w:szCs w:val="18"/>
               </w:rPr>
-              <w:t xml:space="preserve">28 August 2026</w:t>
+              <w:t xml:space="preserve">24 September 2026</w:t>
             </w:r>
           </w:p>
         </w:tc>
@@ -7474,7 +7474,7 @@
                 <w:sz w:val="18"/>
                 <w:szCs w:val="18"/>
               </w:rPr>
-              <w:t xml:space="preserve">11 September 2026</w:t>
+              <w:t xml:space="preserve">8 October 2026</w:t>
             </w:r>
           </w:p>
         </w:tc>
@@ -7528,7 +7528,7 @@
                 <w:sz w:val="18"/>
                 <w:szCs w:val="18"/>
               </w:rPr>
-              <w:t xml:space="preserve">16 September 2026</w:t>
+              <w:t xml:space="preserve">13 October 2026</w:t>
             </w:r>
           </w:p>
         </w:tc>
@@ -7584,7 +7584,7 @@
                 <w:sz w:val="18"/>
                 <w:szCs w:val="18"/>
               </w:rPr>
-              <w:t xml:space="preserve">25 September 2026, 17:00 AEST</w:t>
+              <w:t xml:space="preserve">22 October 2026, 17:00 AEST</w:t>
             </w:r>
           </w:p>
         </w:tc>
@@ -7638,7 +7638,7 @@
                 <w:sz w:val="18"/>
                 <w:szCs w:val="18"/>
               </w:rPr>
-              <w:t xml:space="preserve">October 2026</w:t>
+              <w:t xml:space="preserve">November 2026</w:t>
             </w:r>
           </w:p>
         </w:tc>
@@ -7694,7 +7694,7 @@
                 <w:sz w:val="18"/>
                 <w:szCs w:val="18"/>
               </w:rPr>
-              <w:t xml:space="preserve">early November 2026</w:t>
+              <w:t xml:space="preserve">early December 2026</w:t>
             </w:r>
           </w:p>
         </w:tc>
@@ -8024,7 +8024,7 @@
                 <w:sz w:val="18"/>
                 <w:szCs w:val="18"/>
               </w:rPr>
-              <w:t xml:space="preserve">3–4 weeks — target arrival Q1 2027</w:t>
+              <w:t xml:space="preserve">3–4 weeks — target arrival Q2 2027</w:t>
             </w:r>
           </w:p>
         </w:tc>
@@ -15866,7 +15866,7 @@
           <w:sz w:val="16"/>
           <w:szCs w:val="16"/>
         </w:rPr>
-        <w:t xml:space="preserve">Container Workshop · RFQ-CW-2026-001 · rev C · issued 2026-08-28 · The Carbon Project · aaron@carbonproject.com.au</w:t>
+        <w:t xml:space="preserve">Container Workshop · RFQ-CW-2026-001 · rev C · issued 2026-09-24 · The Carbon Project · aaron@carbonproject.com.au</w:t>
       </w:r>
     </w:p>
     <w:sectPr>

</xml_diff>